<commit_message>
docs: replace flow diagram with Dify canvas screenshot
</commit_message>
<xml_diff>
--- a/docs/quickstart.docx
+++ b/docs/quickstart.docx
@@ -4173,7 +4173,7 @@
       <w:r>
         <w:drawing>
           <wp:inline xmlns:a="http://schemas.openxmlformats.org/drawingml/2006/main" xmlns:pic="http://schemas.openxmlformats.org/drawingml/2006/picture">
-            <wp:extent cx="5832000" cy="3013561"/>
+            <wp:extent cx="5832000" cy="2321724"/>
             <wp:docPr id="1" name="Picture 1"/>
             <wp:cNvGraphicFramePr>
               <a:graphicFrameLocks noChangeAspect="1"/>
@@ -4182,7 +4182,7 @@
               <a:graphicData uri="http://schemas.openxmlformats.org/drawingml/2006/picture">
                 <pic:pic>
                   <pic:nvPicPr>
-                    <pic:cNvPr id="0" name="dify_content_factory_flow.png"/>
+                    <pic:cNvPr id="0" name="微信图片_20261020151356_137_5.png"/>
                     <pic:cNvPicPr/>
                   </pic:nvPicPr>
                   <pic:blipFill>
@@ -4194,7 +4194,7 @@
                   <pic:spPr>
                     <a:xfrm>
                       <a:off x="0" y="0"/>
-                      <a:ext cx="5832000" cy="3013561"/>
+                      <a:ext cx="5832000" cy="2321724"/>
                     </a:xfrm>
                     <a:prstGeom prst="rect"/>
                   </pic:spPr>
@@ -4217,7 +4217,7 @@
           <w:color w:val="6B7280"/>
           <w:sz w:val="18"/>
         </w:rPr>
-        <w:t>图 1：智能内容生产 Chatflow 拓扑示意（分支内部节点已折叠展示）</w:t>
+        <w:t>图 1：智能内容生产 Chatflow 画布</w:t>
       </w:r>
     </w:p>
     <w:p>

</xml_diff>

<commit_message>
docs: rename example app to 文案生成助手
</commit_message>
<xml_diff>
--- a/docs/quickstart.docx
+++ b/docs/quickstart.docx
@@ -267,7 +267,7 @@
                 <w:color w:val="1F2937"/>
                 <w:sz w:val="19"/>
               </w:rPr>
-              <w:t>智能内容生产 Chatflow（23 节点 / 28 连线）</w:t>
+              <w:t>文案生成助手（23 节点 / 28 连线）</w:t>
             </w:r>
           </w:p>
         </w:tc>
@@ -842,7 +842,7 @@
                 <w:color w:val="1F2937"/>
                 <w:sz w:val="19"/>
               </w:rPr>
-              <w:t>23 节点智能内容生产 Chatflow 的需求、结构、校验与导入</w:t>
+              <w:t>23 节点文案生成助手 Chatflow 的需求、结构、校验与导入</w:t>
             </w:r>
           </w:p>
         </w:tc>
@@ -2802,7 +2802,7 @@
           <w:color w:val="2563EB"/>
           <w:sz w:val="32"/>
         </w:rPr>
-        <w:t>🏭 完整案例：智能内容生产 Chatflow</w:t>
+        <w:t>🏭 完整案例：文案生成助手</w:t>
       </w:r>
     </w:p>
     <w:p>
@@ -3362,7 +3362,7 @@
                 <w:color w:val="1F2937"/>
                 <w:sz w:val="19"/>
               </w:rPr>
-              <w:t>可以。建议做“智能内容生产 Chatflow”：参数提取 → 平台分类 → 小红书/公众号/短视频/通用四分支 → 代码质检 → 不合格自动修改 → 聚合输出。</w:t>
+              <w:t>可以。建议做“文案生成助手”：参数提取 → 平台分类 → 小红书/公众号/短视频/通用四分支 → 代码质检 → 不合格自动修改 → 聚合输出。</w:t>
             </w:r>
           </w:p>
         </w:tc>
@@ -3657,7 +3657,7 @@
                 <w:color w:val="1F2937"/>
                 <w:sz w:val="19"/>
               </w:rPr>
-              <w:t>C:\Users\yezen\Downloads\青莲智能内容生产Chatflow.yml</w:t>
+              <w:t>C:\Users\yezen\Downloads\青莲文案生成助手Chatflow.yml</w:t>
             </w:r>
           </w:p>
         </w:tc>
@@ -4217,7 +4217,7 @@
           <w:color w:val="6B7280"/>
           <w:sz w:val="18"/>
         </w:rPr>
-        <w:t>图 1：智能内容生产 Chatflow 画布</w:t>
+        <w:t>图 1：文案生成助手 Chatflow 画布</w:t>
       </w:r>
     </w:p>
     <w:p>
@@ -6195,7 +6195,7 @@
           <w:color w:val="1F2937"/>
           <w:sz w:val="21"/>
         </w:rPr>
-        <w:t>分类器只决定“走哪条内容生产线”，不负责生成内容。</w:t>
+        <w:t>分类器只决定“走哪条文案生产线”，不负责生成内容。</w:t>
       </w:r>
     </w:p>
     <w:p>
@@ -6372,7 +6372,7 @@
                 <w:color w:val="1F2937"/>
                 <w:sz w:val="19"/>
               </w:rPr>
-              <w:t>python scripts\validate_dify_dsl.py "C:\Users\yezen\Downloads\青莲智能内容生产Chatflow.yml"</w:t>
+              <w:t>python scripts\validate_dify_dsl.py "C:\Users\yezen\Downloads\青莲文案生成助手Chatflow.yml"</w:t>
             </w:r>
           </w:p>
         </w:tc>
@@ -6630,7 +6630,7 @@
           <w:color w:val="1F2937"/>
           <w:sz w:val="21"/>
         </w:rPr>
-        <w:t>选择 C:\Users\yezen\Downloads\青莲智能内容生产Chatflow.yml。</w:t>
+        <w:t>选择 C:\Users\yezen\Downloads\青莲文案生成助手Chatflow.yml。</w:t>
       </w:r>
     </w:p>
     <w:p>
@@ -8903,7 +8903,7 @@
                 <w:color w:val="1F2937"/>
                 <w:sz w:val="18"/>
               </w:rPr>
-              <w:t>能。本案例的 23 节点内容生产 Chatflow 就完全不依赖知识库。</w:t>
+              <w:t>能。本案例的 23 节点文案生成助手 Chatflow 就完全不依赖知识库。</w:t>
             </w:r>
           </w:p>
         </w:tc>

</xml_diff>